<commit_message>
docs(av1): relatório com as evidências do 710ef50
Seções 4.2 e 4.3 e Apêndice B.1 com a nova execução dos testes e do teste
de corrida; seção 2 diz quem gerou essas evidências e em qual commit.

Co-authored-by: Andre Bueno Ocanha <andre.ocanha@estudante.ufla.br>
Co-Authored-By: Claude Opus 5.5 <noreply@anthropic.com>
Claude-Session: https://claude.ai/code/session_01W6tNBw7crDxiBqVKr8oJJ5
</commit_message>
<xml_diff>
--- a/docs/relatorio/RELATORIO_AV1.docx
+++ b/docs/relatorio/RELATORIO_AV1.docx
@@ -1273,7 +1273,34 @@
         <w:t xml:space="preserve"> </w:t>
       </w:r>
       <w:r>
-        <w:t xml:space="preserve">fase do gravador, D-22, e as evidências 4.2 e 4.3). As coletas físicas foram feitas pelo grupo em</w:t>
+        <w:t xml:space="preserve">fase do gravador, D-22). As evidências 4.2 e 4.3 foram geradas de novo por João Paulo Silva com</w:t>
+      </w:r>
+      <w:r>
+        <w:t xml:space="preserve"> </w:t>
+      </w:r>
+      <w:r>
+        <w:rPr>
+          <w:rStyle w:val="VerbatimChar"/>
+        </w:rPr>
+        <w:t xml:space="preserve">scripts/av1_evidencias.ps1</w:t>
+      </w:r>
+      <w:r>
+        <w:t xml:space="preserve"> </w:t>
+      </w:r>
+      <w:r>
+        <w:t xml:space="preserve">no commit</w:t>
+      </w:r>
+      <w:r>
+        <w:t xml:space="preserve"> </w:t>
+      </w:r>
+      <w:r>
+        <w:rPr>
+          <w:rStyle w:val="VerbatimChar"/>
+        </w:rPr>
+        <w:t xml:space="preserve">710ef50</w:t>
+      </w:r>
+      <w:r>
+        <w:t xml:space="preserve">, com a árvore limpa. As coletas físicas foram feitas pelo grupo em</w:t>
       </w:r>
       <w:r>
         <w:t xml:space="preserve"> </w:t>
@@ -3007,13 +3034,13 @@
         <w:rPr>
           <w:rStyle w:val="VerbatimChar"/>
         </w:rPr>
-        <w:t xml:space="preserve">b9c70d3</w:t>
-      </w:r>
-      <w:r>
-        <w:t xml:space="preserve"> </w:t>
-      </w:r>
-      <w:r>
-        <w:t xml:space="preserve">(com alterações não comitadas) · executado por juliano.ramos@estudante.ufla.br em CORSA / Microsoft Windows NT 10.0.26100.0</w:t>
+        <w:t xml:space="preserve">710ef50</w:t>
+      </w:r>
+      <w:r>
+        <w:t xml:space="preserve"> </w:t>
+      </w:r>
+      <w:r>
+        <w:t xml:space="preserve">(árvore limpa) · executado por joao.silva86@estudante.ufla.br em JOAO-PAULO / Microsoft Windows NT 10.0.26300.0</w:t>
       </w:r>
     </w:p>
     <w:p>
@@ -3025,7 +3052,7 @@
         <w:pStyle w:val="Compact"/>
       </w:pPr>
       <w:r>
-        <w:t xml:space="preserve">Início: 21/10/2026 20:38:13 · fim: 20:38:57 · código de saída: 0</w:t>
+        <w:t xml:space="preserve">Início: 22/10/2026 23:26:56 · fim: 23:27:23 · código de saída: 0</w:t>
       </w:r>
     </w:p>
     <w:p>
@@ -3037,7 +3064,7 @@
           <w:bCs/>
           <w:b/>
         </w:rPr>
-        <w:t xml:space="preserve">Total: 157 testes em 28 classes, 0 falhas, 0 erros, 3 ignorados.</w:t>
+        <w:t xml:space="preserve">Total: 161 testes em 29 classes, 0 falhas, 0 erros, 0 ignorados.</w:t>
       </w:r>
       <w:r>
         <w:t xml:space="preserve"> </w:t>
@@ -3095,13 +3122,13 @@
         <w:rPr>
           <w:rStyle w:val="VerbatimChar"/>
         </w:rPr>
-        <w:t xml:space="preserve">b9c70d3</w:t>
-      </w:r>
-      <w:r>
-        <w:t xml:space="preserve"> </w:t>
-      </w:r>
-      <w:r>
-        <w:t xml:space="preserve">(com alterações não comitadas), CORSA / Microsoft Windows NT 10.0.26100.0.</w:t>
+        <w:t xml:space="preserve">710ef50</w:t>
+      </w:r>
+      <w:r>
+        <w:t xml:space="preserve"> </w:t>
+      </w:r>
+      <w:r>
+        <w:t xml:space="preserve">(árvore limpa), JOAO-PAULO / Microsoft Windows NT 10.0.26300.0.</w:t>
       </w:r>
     </w:p>
     <w:tbl>
@@ -3243,7 +3270,7 @@
               <w:jc w:val="left"/>
             </w:pPr>
             <w:r>
-              <w:t xml:space="preserve">21/10/2026 20:38:57</w:t>
+              <w:t xml:space="preserve">22/10/2026 23:27:24</w:t>
             </w:r>
           </w:p>
         </w:tc>
@@ -3279,19 +3306,19 @@
               <w:jc w:val="left"/>
             </w:pPr>
             <w:r>
-              <w:t xml:space="preserve">0.077</w:t>
-            </w:r>
-          </w:p>
-        </w:tc>
-        <w:tc>
-          <w:tcPr/>
-          <w:p>
-            <w:pPr>
-              <w:pStyle w:val="Compact"/>
-              <w:jc w:val="left"/>
-            </w:pPr>
-            <w:r>
-              <w:t xml:space="preserve">16</w:t>
+              <w:t xml:space="preserve">0.059</w:t>
+            </w:r>
+          </w:p>
+        </w:tc>
+        <w:tc>
+          <w:tcPr/>
+          <w:p>
+            <w:pPr>
+              <w:pStyle w:val="Compact"/>
+              <w:jc w:val="left"/>
+            </w:pPr>
+            <w:r>
+              <w:t xml:space="preserve">6.8</w:t>
             </w:r>
           </w:p>
         </w:tc>
@@ -3341,7 +3368,7 @@
               <w:jc w:val="left"/>
             </w:pPr>
             <w:r>
-              <w:t xml:space="preserve">21/10/2026 20:39:13</w:t>
+              <w:t xml:space="preserve">22/10/2026 23:27:30</w:t>
             </w:r>
           </w:p>
         </w:tc>
@@ -3377,19 +3404,19 @@
               <w:jc w:val="left"/>
             </w:pPr>
             <w:r>
-              <w:t xml:space="preserve">0.084</w:t>
-            </w:r>
-          </w:p>
-        </w:tc>
-        <w:tc>
-          <w:tcPr/>
-          <w:p>
-            <w:pPr>
-              <w:pStyle w:val="Compact"/>
-              <w:jc w:val="left"/>
-            </w:pPr>
-            <w:r>
-              <w:t xml:space="preserve">14.1</w:t>
+              <w:t xml:space="preserve">0.053</w:t>
+            </w:r>
+          </w:p>
+        </w:tc>
+        <w:tc>
+          <w:tcPr/>
+          <w:p>
+            <w:pPr>
+              <w:pStyle w:val="Compact"/>
+              <w:jc w:val="left"/>
+            </w:pPr>
+            <w:r>
+              <w:t xml:space="preserve">8.8</w:t>
             </w:r>
           </w:p>
         </w:tc>
@@ -3439,7 +3466,7 @@
               <w:jc w:val="left"/>
             </w:pPr>
             <w:r>
-              <w:t xml:space="preserve">21/10/2026 20:39:27</w:t>
+              <w:t xml:space="preserve">22/10/2026 23:27:39</w:t>
             </w:r>
           </w:p>
         </w:tc>
@@ -3475,19 +3502,19 @@
               <w:jc w:val="left"/>
             </w:pPr>
             <w:r>
-              <w:t xml:space="preserve">0.08</w:t>
-            </w:r>
-          </w:p>
-        </w:tc>
-        <w:tc>
-          <w:tcPr/>
-          <w:p>
-            <w:pPr>
-              <w:pStyle w:val="Compact"/>
-              <w:jc w:val="left"/>
-            </w:pPr>
-            <w:r>
-              <w:t xml:space="preserve">13.1</w:t>
+              <w:t xml:space="preserve">0.059</w:t>
+            </w:r>
+          </w:p>
+        </w:tc>
+        <w:tc>
+          <w:tcPr/>
+          <w:p>
+            <w:pPr>
+              <w:pStyle w:val="Compact"/>
+              <w:jc w:val="left"/>
+            </w:pPr>
+            <w:r>
+              <w:t xml:space="preserve">8.9</w:t>
             </w:r>
           </w:p>
         </w:tc>
@@ -3537,7 +3564,7 @@
               <w:jc w:val="left"/>
             </w:pPr>
             <w:r>
-              <w:t xml:space="preserve">21/10/2026 20:39:40</w:t>
+              <w:t xml:space="preserve">22/10/2026 23:27:48</w:t>
             </w:r>
           </w:p>
         </w:tc>
@@ -3573,19 +3600,19 @@
               <w:jc w:val="left"/>
             </w:pPr>
             <w:r>
-              <w:t xml:space="preserve">0.079</w:t>
-            </w:r>
-          </w:p>
-        </w:tc>
-        <w:tc>
-          <w:tcPr/>
-          <w:p>
-            <w:pPr>
-              <w:pStyle w:val="Compact"/>
-              <w:jc w:val="left"/>
-            </w:pPr>
-            <w:r>
-              <w:t xml:space="preserve">11.5</w:t>
+              <w:t xml:space="preserve">0.061</w:t>
+            </w:r>
+          </w:p>
+        </w:tc>
+        <w:tc>
+          <w:tcPr/>
+          <w:p>
+            <w:pPr>
+              <w:pStyle w:val="Compact"/>
+              <w:jc w:val="left"/>
+            </w:pPr>
+            <w:r>
+              <w:t xml:space="preserve">8.2</w:t>
             </w:r>
           </w:p>
         </w:tc>
@@ -3635,7 +3662,7 @@
               <w:jc w:val="left"/>
             </w:pPr>
             <w:r>
-              <w:t xml:space="preserve">21/10/2026 20:39:52</w:t>
+              <w:t xml:space="preserve">22/10/2026 23:27:56</w:t>
             </w:r>
           </w:p>
         </w:tc>
@@ -3671,19 +3698,19 @@
               <w:jc w:val="left"/>
             </w:pPr>
             <w:r>
-              <w:t xml:space="preserve">0.103</w:t>
-            </w:r>
-          </w:p>
-        </w:tc>
-        <w:tc>
-          <w:tcPr/>
-          <w:p>
-            <w:pPr>
-              <w:pStyle w:val="Compact"/>
-              <w:jc w:val="left"/>
-            </w:pPr>
-            <w:r>
-              <w:t xml:space="preserve">11.4</w:t>
+              <w:t xml:space="preserve">0.059</w:t>
+            </w:r>
+          </w:p>
+        </w:tc>
+        <w:tc>
+          <w:tcPr/>
+          <w:p>
+            <w:pPr>
+              <w:pStyle w:val="Compact"/>
+              <w:jc w:val="left"/>
+            </w:pPr>
+            <w:r>
+              <w:t xml:space="preserve">8.8</w:t>
             </w:r>
           </w:p>
         </w:tc>
@@ -3733,7 +3760,7 @@
               <w:jc w:val="left"/>
             </w:pPr>
             <w:r>
-              <w:t xml:space="preserve">21/10/2026 20:40:03</w:t>
+              <w:t xml:space="preserve">22/10/2026 23:28:05</w:t>
             </w:r>
           </w:p>
         </w:tc>
@@ -3769,19 +3796,19 @@
               <w:jc w:val="left"/>
             </w:pPr>
             <w:r>
-              <w:t xml:space="preserve">0.076</w:t>
-            </w:r>
-          </w:p>
-        </w:tc>
-        <w:tc>
-          <w:tcPr/>
-          <w:p>
-            <w:pPr>
-              <w:pStyle w:val="Compact"/>
-              <w:jc w:val="left"/>
-            </w:pPr>
-            <w:r>
-              <w:t xml:space="preserve">11.2</w:t>
+              <w:t xml:space="preserve">0.055</w:t>
+            </w:r>
+          </w:p>
+        </w:tc>
+        <w:tc>
+          <w:tcPr/>
+          <w:p>
+            <w:pPr>
+              <w:pStyle w:val="Compact"/>
+              <w:jc w:val="left"/>
+            </w:pPr>
+            <w:r>
+              <w:t xml:space="preserve">8.3</w:t>
             </w:r>
           </w:p>
         </w:tc>
@@ -3831,7 +3858,7 @@
               <w:jc w:val="left"/>
             </w:pPr>
             <w:r>
-              <w:t xml:space="preserve">21/10/2026 20:40:15</w:t>
+              <w:t xml:space="preserve">22/10/2026 23:28:14</w:t>
             </w:r>
           </w:p>
         </w:tc>
@@ -3867,19 +3894,19 @@
               <w:jc w:val="left"/>
             </w:pPr>
             <w:r>
-              <w:t xml:space="preserve">0.079</w:t>
-            </w:r>
-          </w:p>
-        </w:tc>
-        <w:tc>
-          <w:tcPr/>
-          <w:p>
-            <w:pPr>
-              <w:pStyle w:val="Compact"/>
-              <w:jc w:val="left"/>
-            </w:pPr>
-            <w:r>
-              <w:t xml:space="preserve">10.7</w:t>
+              <w:t xml:space="preserve">0.058</w:t>
+            </w:r>
+          </w:p>
+        </w:tc>
+        <w:tc>
+          <w:tcPr/>
+          <w:p>
+            <w:pPr>
+              <w:pStyle w:val="Compact"/>
+              <w:jc w:val="left"/>
+            </w:pPr>
+            <w:r>
+              <w:t xml:space="preserve">8.6</w:t>
             </w:r>
           </w:p>
         </w:tc>
@@ -3929,7 +3956,7 @@
               <w:jc w:val="left"/>
             </w:pPr>
             <w:r>
-              <w:t xml:space="preserve">21/10/2026 20:40:25</w:t>
+              <w:t xml:space="preserve">22/10/2026 23:28:22</w:t>
             </w:r>
           </w:p>
         </w:tc>
@@ -3965,19 +3992,19 @@
               <w:jc w:val="left"/>
             </w:pPr>
             <w:r>
-              <w:t xml:space="preserve">0.073</w:t>
-            </w:r>
-          </w:p>
-        </w:tc>
-        <w:tc>
-          <w:tcPr/>
-          <w:p>
-            <w:pPr>
-              <w:pStyle w:val="Compact"/>
-              <w:jc w:val="left"/>
-            </w:pPr>
-            <w:r>
-              <w:t xml:space="preserve">11</w:t>
+              <w:t xml:space="preserve">0.055</w:t>
+            </w:r>
+          </w:p>
+        </w:tc>
+        <w:tc>
+          <w:tcPr/>
+          <w:p>
+            <w:pPr>
+              <w:pStyle w:val="Compact"/>
+              <w:jc w:val="left"/>
+            </w:pPr>
+            <w:r>
+              <w:t xml:space="preserve">8.6</w:t>
             </w:r>
           </w:p>
         </w:tc>
@@ -4027,7 +4054,7 @@
               <w:jc w:val="left"/>
             </w:pPr>
             <w:r>
-              <w:t xml:space="preserve">21/10/2026 20:40:36</w:t>
+              <w:t xml:space="preserve">22/10/2026 23:28:31</w:t>
             </w:r>
           </w:p>
         </w:tc>
@@ -4063,19 +4090,19 @@
               <w:jc w:val="left"/>
             </w:pPr>
             <w:r>
-              <w:t xml:space="preserve">0.076</w:t>
-            </w:r>
-          </w:p>
-        </w:tc>
-        <w:tc>
-          <w:tcPr/>
-          <w:p>
-            <w:pPr>
-              <w:pStyle w:val="Compact"/>
-              <w:jc w:val="left"/>
-            </w:pPr>
-            <w:r>
-              <w:t xml:space="preserve">10.9</w:t>
+              <w:t xml:space="preserve">0.059</w:t>
+            </w:r>
+          </w:p>
+        </w:tc>
+        <w:tc>
+          <w:tcPr/>
+          <w:p>
+            <w:pPr>
+              <w:pStyle w:val="Compact"/>
+              <w:jc w:val="left"/>
+            </w:pPr>
+            <w:r>
+              <w:t xml:space="preserve">8.3</w:t>
             </w:r>
           </w:p>
         </w:tc>
@@ -4125,7 +4152,7 @@
               <w:jc w:val="left"/>
             </w:pPr>
             <w:r>
-              <w:t xml:space="preserve">21/10/2026 20:40:47</w:t>
+              <w:t xml:space="preserve">22/10/2026 23:28:39</w:t>
             </w:r>
           </w:p>
         </w:tc>
@@ -4161,19 +4188,19 @@
               <w:jc w:val="left"/>
             </w:pPr>
             <w:r>
-              <w:t xml:space="preserve">0.079</w:t>
-            </w:r>
-          </w:p>
-        </w:tc>
-        <w:tc>
-          <w:tcPr/>
-          <w:p>
-            <w:pPr>
-              <w:pStyle w:val="Compact"/>
-              <w:jc w:val="left"/>
-            </w:pPr>
-            <w:r>
-              <w:t xml:space="preserve">10.5</w:t>
+              <w:t xml:space="preserve">0.055</w:t>
+            </w:r>
+          </w:p>
+        </w:tc>
+        <w:tc>
+          <w:tcPr/>
+          <w:p>
+            <w:pPr>
+              <w:pStyle w:val="Compact"/>
+              <w:jc w:val="left"/>
+            </w:pPr>
+            <w:r>
+              <w:t xml:space="preserve">8.3</w:t>
             </w:r>
           </w:p>
         </w:tc>
@@ -10389,7 +10416,7 @@
         <w:t xml:space="preserve"> </w:t>
       </w:r>
       <w:r>
-        <w:t xml:space="preserve">2.0.21, JUnit 4.13.2), os testes de domínio, S2 e AV1 — 84 testes, zero falhas — e gerou o</w:t>
+        <w:t xml:space="preserve">2.0.21, JUnit 4.13.2), os testes de domínio, S2 e AV1 — 86 testes, zero falhas — e gerou o</w:t>
       </w:r>
       <w:r>
         <w:t xml:space="preserve"> </w:t>
@@ -14006,13 +14033,13 @@
         <w:rPr>
           <w:rStyle w:val="VerbatimChar"/>
         </w:rPr>
-        <w:t xml:space="preserve">b9c70d3</w:t>
-      </w:r>
-      <w:r>
-        <w:t xml:space="preserve"> </w:t>
-      </w:r>
-      <w:r>
-        <w:t xml:space="preserve">(com alterações não comitadas) · executado por juliano.ramos@estudante.ufla.br em CORSA / Microsoft Windows NT 10.0.26100.0</w:t>
+        <w:t xml:space="preserve">710ef50</w:t>
+      </w:r>
+      <w:r>
+        <w:t xml:space="preserve"> </w:t>
+      </w:r>
+      <w:r>
+        <w:t xml:space="preserve">(árvore limpa) · executado por joao.silva86@estudante.ufla.br em JOAO-PAULO / Microsoft Windows NT 10.0.26300.0</w:t>
       </w:r>
     </w:p>
     <w:p>
@@ -14024,7 +14051,7 @@
         <w:pStyle w:val="Compact"/>
       </w:pPr>
       <w:r>
-        <w:t xml:space="preserve">Início: 21/10/2026 20:38:13 · fim: 20:38:57 · código de saída: 0</w:t>
+        <w:t xml:space="preserve">Início: 22/10/2026 23:26:56 · fim: 23:27:23 · código de saída: 0</w:t>
       </w:r>
     </w:p>
     <w:tbl>
@@ -14140,7 +14167,7 @@
               <w:jc w:val="left"/>
             </w:pPr>
             <w:r>
-              <w:t xml:space="preserve">2</w:t>
+              <w:t xml:space="preserve">3</w:t>
             </w:r>
           </w:p>
         </w:tc>
@@ -14188,7 +14215,7 @@
               <w:jc w:val="left"/>
             </w:pPr>
             <w:r>
-              <w:t xml:space="preserve">0.106</w:t>
+              <w:t xml:space="preserve">0.133</w:t>
             </w:r>
           </w:p>
         </w:tc>
@@ -14262,7 +14289,7 @@
               <w:jc w:val="left"/>
             </w:pPr>
             <w:r>
-              <w:t xml:space="preserve">0.086</w:t>
+              <w:t xml:space="preserve">0.092</w:t>
             </w:r>
           </w:p>
         </w:tc>
@@ -14336,7 +14363,7 @@
               <w:jc w:val="left"/>
             </w:pPr>
             <w:r>
-              <w:t xml:space="preserve">0.278</w:t>
+              <w:t xml:space="preserve">0.298</w:t>
             </w:r>
           </w:p>
         </w:tc>
@@ -14436,7 +14463,7 @@
               <w:jc w:val="left"/>
             </w:pPr>
             <w:r>
-              <w:t xml:space="preserve">3</w:t>
+              <w:t xml:space="preserve">5</w:t>
             </w:r>
           </w:p>
         </w:tc>
@@ -14472,19 +14499,19 @@
               <w:jc w:val="left"/>
             </w:pPr>
             <w:r>
-              <w:t xml:space="preserve">3</w:t>
-            </w:r>
-          </w:p>
-        </w:tc>
-        <w:tc>
-          <w:tcPr/>
-          <w:p>
-            <w:pPr>
-              <w:pStyle w:val="Compact"/>
-              <w:jc w:val="left"/>
-            </w:pPr>
-            <w:r>
-              <w:t xml:space="preserve">0.017</w:t>
+              <w:t xml:space="preserve">0</w:t>
+            </w:r>
+          </w:p>
+        </w:tc>
+        <w:tc>
+          <w:tcPr/>
+          <w:p>
+            <w:pPr>
+              <w:pStyle w:val="Compact"/>
+              <w:jc w:val="left"/>
+            </w:pPr>
+            <w:r>
+              <w:t xml:space="preserve">1.719</w:t>
             </w:r>
           </w:p>
         </w:tc>
@@ -14558,7 +14585,7 @@
               <w:jc w:val="left"/>
             </w:pPr>
             <w:r>
-              <w:t xml:space="preserve">0.002</w:t>
+              <w:t xml:space="preserve">0.004</w:t>
             </w:r>
           </w:p>
         </w:tc>
@@ -14572,19 +14599,19 @@
               <w:jc w:val="left"/>
             </w:pPr>
             <w:r>
-              <w:t xml:space="preserve">com.example.rastro.av1.MatrizTest</w:t>
-            </w:r>
-          </w:p>
-        </w:tc>
-        <w:tc>
-          <w:tcPr/>
-          <w:p>
-            <w:pPr>
-              <w:pStyle w:val="Compact"/>
-              <w:jc w:val="left"/>
-            </w:pPr>
-            <w:r>
-              <w:t xml:space="preserve">3</w:t>
+              <w:t xml:space="preserve">com.example.rastro.av1.JanelasTest</w:t>
+            </w:r>
+          </w:p>
+        </w:tc>
+        <w:tc>
+          <w:tcPr/>
+          <w:p>
+            <w:pPr>
+              <w:pStyle w:val="Compact"/>
+              <w:jc w:val="left"/>
+            </w:pPr>
+            <w:r>
+              <w:t xml:space="preserve">1</w:t>
             </w:r>
           </w:p>
         </w:tc>
@@ -14632,7 +14659,7 @@
               <w:jc w:val="left"/>
             </w:pPr>
             <w:r>
-              <w:t xml:space="preserve">0.004</w:t>
+              <w:t xml:space="preserve">0.0</w:t>
             </w:r>
           </w:p>
         </w:tc>
@@ -14646,19 +14673,19 @@
               <w:jc w:val="left"/>
             </w:pPr>
             <w:r>
-              <w:t xml:space="preserve">com.example.rastro.av1.ReconciliadorTest</w:t>
-            </w:r>
-          </w:p>
-        </w:tc>
-        <w:tc>
-          <w:tcPr/>
-          <w:p>
-            <w:pPr>
-              <w:pStyle w:val="Compact"/>
-              <w:jc w:val="left"/>
-            </w:pPr>
-            <w:r>
-              <w:t xml:space="preserve">6</w:t>
+              <w:t xml:space="preserve">com.example.rastro.av1.MatrizTest</w:t>
+            </w:r>
+          </w:p>
+        </w:tc>
+        <w:tc>
+          <w:tcPr/>
+          <w:p>
+            <w:pPr>
+              <w:pStyle w:val="Compact"/>
+              <w:jc w:val="left"/>
+            </w:pPr>
+            <w:r>
+              <w:t xml:space="preserve">3</w:t>
             </w:r>
           </w:p>
         </w:tc>
@@ -14706,7 +14733,7 @@
               <w:jc w:val="left"/>
             </w:pPr>
             <w:r>
-              <w:t xml:space="preserve">0.037</w:t>
+              <w:t xml:space="preserve">0.007</w:t>
             </w:r>
           </w:p>
         </w:tc>
@@ -14720,19 +14747,19 @@
               <w:jc w:val="left"/>
             </w:pPr>
             <w:r>
-              <w:t xml:space="preserve">com.example.rastro.av1.RegistroCsvTest</w:t>
-            </w:r>
-          </w:p>
-        </w:tc>
-        <w:tc>
-          <w:tcPr/>
-          <w:p>
-            <w:pPr>
-              <w:pStyle w:val="Compact"/>
-              <w:jc w:val="left"/>
-            </w:pPr>
-            <w:r>
-              <w:t xml:space="preserve">4</w:t>
+              <w:t xml:space="preserve">com.example.rastro.av1.ReconciliadorTest</w:t>
+            </w:r>
+          </w:p>
+        </w:tc>
+        <w:tc>
+          <w:tcPr/>
+          <w:p>
+            <w:pPr>
+              <w:pStyle w:val="Compact"/>
+              <w:jc w:val="left"/>
+            </w:pPr>
+            <w:r>
+              <w:t xml:space="preserve">6</w:t>
             </w:r>
           </w:p>
         </w:tc>
@@ -14780,7 +14807,7 @@
               <w:jc w:val="left"/>
             </w:pPr>
             <w:r>
-              <w:t xml:space="preserve">0.006</w:t>
+              <w:t xml:space="preserve">0.032</w:t>
             </w:r>
           </w:p>
         </w:tc>
@@ -14794,19 +14821,19 @@
               <w:jc w:val="left"/>
             </w:pPr>
             <w:r>
-              <w:t xml:space="preserve">com.example.rastro.av1.ReprodutorRegistroTest</w:t>
-            </w:r>
-          </w:p>
-        </w:tc>
-        <w:tc>
-          <w:tcPr/>
-          <w:p>
-            <w:pPr>
-              <w:pStyle w:val="Compact"/>
-              <w:jc w:val="left"/>
-            </w:pPr>
-            <w:r>
-              <w:t xml:space="preserve">1</w:t>
+              <w:t xml:space="preserve">com.example.rastro.av1.RegistroCsvTest</w:t>
+            </w:r>
+          </w:p>
+        </w:tc>
+        <w:tc>
+          <w:tcPr/>
+          <w:p>
+            <w:pPr>
+              <w:pStyle w:val="Compact"/>
+              <w:jc w:val="left"/>
+            </w:pPr>
+            <w:r>
+              <w:t xml:space="preserve">4</w:t>
             </w:r>
           </w:p>
         </w:tc>
@@ -14854,7 +14881,7 @@
               <w:jc w:val="left"/>
             </w:pPr>
             <w:r>
-              <w:t xml:space="preserve">0.018</w:t>
+              <w:t xml:space="preserve">0.003</w:t>
             </w:r>
           </w:p>
         </w:tc>
@@ -14868,19 +14895,19 @@
               <w:jc w:val="left"/>
             </w:pPr>
             <w:r>
-              <w:t xml:space="preserve">com.example.rastro.chat.ChatProtocolTest</w:t>
-            </w:r>
-          </w:p>
-        </w:tc>
-        <w:tc>
-          <w:tcPr/>
-          <w:p>
-            <w:pPr>
-              <w:pStyle w:val="Compact"/>
-              <w:jc w:val="left"/>
-            </w:pPr>
-            <w:r>
-              <w:t xml:space="preserve">8</w:t>
+              <w:t xml:space="preserve">com.example.rastro.av1.ReprodutorRegistroTest</w:t>
+            </w:r>
+          </w:p>
+        </w:tc>
+        <w:tc>
+          <w:tcPr/>
+          <w:p>
+            <w:pPr>
+              <w:pStyle w:val="Compact"/>
+              <w:jc w:val="left"/>
+            </w:pPr>
+            <w:r>
+              <w:t xml:space="preserve">1</w:t>
             </w:r>
           </w:p>
         </w:tc>
@@ -14928,7 +14955,7 @@
               <w:jc w:val="left"/>
             </w:pPr>
             <w:r>
-              <w:t xml:space="preserve">0.581</w:t>
+              <w:t xml:space="preserve">0.02</w:t>
             </w:r>
           </w:p>
         </w:tc>
@@ -14942,19 +14969,19 @@
               <w:jc w:val="left"/>
             </w:pPr>
             <w:r>
-              <w:t xml:space="preserve">com.example.rastro.chat.ChatStoreTest</w:t>
-            </w:r>
-          </w:p>
-        </w:tc>
-        <w:tc>
-          <w:tcPr/>
-          <w:p>
-            <w:pPr>
-              <w:pStyle w:val="Compact"/>
-              <w:jc w:val="left"/>
-            </w:pPr>
-            <w:r>
-              <w:t xml:space="preserve">6</w:t>
+              <w:t xml:space="preserve">com.example.rastro.chat.ChatProtocolTest</w:t>
+            </w:r>
+          </w:p>
+        </w:tc>
+        <w:tc>
+          <w:tcPr/>
+          <w:p>
+            <w:pPr>
+              <w:pStyle w:val="Compact"/>
+              <w:jc w:val="left"/>
+            </w:pPr>
+            <w:r>
+              <w:t xml:space="preserve">8</w:t>
             </w:r>
           </w:p>
         </w:tc>
@@ -15002,7 +15029,7 @@
               <w:jc w:val="left"/>
             </w:pPr>
             <w:r>
-              <w:t xml:space="preserve">9.07</w:t>
+              <w:t xml:space="preserve">0.533</w:t>
             </w:r>
           </w:p>
         </w:tc>
@@ -15016,19 +15043,19 @@
               <w:jc w:val="left"/>
             </w:pPr>
             <w:r>
-              <w:t xml:space="preserve">com.example.rastro.chat.CustodyEngineTest</w:t>
-            </w:r>
-          </w:p>
-        </w:tc>
-        <w:tc>
-          <w:tcPr/>
-          <w:p>
-            <w:pPr>
-              <w:pStyle w:val="Compact"/>
-              <w:jc w:val="left"/>
-            </w:pPr>
-            <w:r>
-              <w:t xml:space="preserve">11</w:t>
+              <w:t xml:space="preserve">com.example.rastro.chat.ChatStoreTest</w:t>
+            </w:r>
+          </w:p>
+        </w:tc>
+        <w:tc>
+          <w:tcPr/>
+          <w:p>
+            <w:pPr>
+              <w:pStyle w:val="Compact"/>
+              <w:jc w:val="left"/>
+            </w:pPr>
+            <w:r>
+              <w:t xml:space="preserve">6</w:t>
             </w:r>
           </w:p>
         </w:tc>
@@ -15076,7 +15103,7 @@
               <w:jc w:val="left"/>
             </w:pPr>
             <w:r>
-              <w:t xml:space="preserve">1.449</w:t>
+              <w:t xml:space="preserve">3.241</w:t>
             </w:r>
           </w:p>
         </w:tc>
@@ -15090,19 +15117,19 @@
               <w:jc w:val="left"/>
             </w:pPr>
             <w:r>
-              <w:t xml:space="preserve">com.example.rastro.chat.ForwardEngineTest</w:t>
-            </w:r>
-          </w:p>
-        </w:tc>
-        <w:tc>
-          <w:tcPr/>
-          <w:p>
-            <w:pPr>
-              <w:pStyle w:val="Compact"/>
-              <w:jc w:val="left"/>
-            </w:pPr>
-            <w:r>
-              <w:t xml:space="preserve">16</w:t>
+              <w:t xml:space="preserve">com.example.rastro.chat.CustodyEngineTest</w:t>
+            </w:r>
+          </w:p>
+        </w:tc>
+        <w:tc>
+          <w:tcPr/>
+          <w:p>
+            <w:pPr>
+              <w:pStyle w:val="Compact"/>
+              <w:jc w:val="left"/>
+            </w:pPr>
+            <w:r>
+              <w:t xml:space="preserve">11</w:t>
             </w:r>
           </w:p>
         </w:tc>
@@ -15150,7 +15177,7 @@
               <w:jc w:val="left"/>
             </w:pPr>
             <w:r>
-              <w:t xml:space="preserve">2.042</w:t>
+              <w:t xml:space="preserve">2.385</w:t>
             </w:r>
           </w:p>
         </w:tc>
@@ -15164,19 +15191,19 @@
               <w:jc w:val="left"/>
             </w:pPr>
             <w:r>
-              <w:t xml:space="preserve">com.example.rastro.ExampleUnitTest</w:t>
-            </w:r>
-          </w:p>
-        </w:tc>
-        <w:tc>
-          <w:tcPr/>
-          <w:p>
-            <w:pPr>
-              <w:pStyle w:val="Compact"/>
-              <w:jc w:val="left"/>
-            </w:pPr>
-            <w:r>
-              <w:t xml:space="preserve">1</w:t>
+              <w:t xml:space="preserve">com.example.rastro.chat.ForwardEngineTest</w:t>
+            </w:r>
+          </w:p>
+        </w:tc>
+        <w:tc>
+          <w:tcPr/>
+          <w:p>
+            <w:pPr>
+              <w:pStyle w:val="Compact"/>
+              <w:jc w:val="left"/>
+            </w:pPr>
+            <w:r>
+              <w:t xml:space="preserve">16</w:t>
             </w:r>
           </w:p>
         </w:tc>
@@ -15224,7 +15251,7 @@
               <w:jc w:val="left"/>
             </w:pPr>
             <w:r>
-              <w:t xml:space="preserve">0.009</w:t>
+              <w:t xml:space="preserve">2.785</w:t>
             </w:r>
           </w:p>
         </w:tc>
@@ -15238,19 +15265,19 @@
               <w:jc w:val="left"/>
             </w:pPr>
             <w:r>
-              <w:t xml:space="preserve">com.example.rastro.IMUReadTest</w:t>
-            </w:r>
-          </w:p>
-        </w:tc>
-        <w:tc>
-          <w:tcPr/>
-          <w:p>
-            <w:pPr>
-              <w:pStyle w:val="Compact"/>
-              <w:jc w:val="left"/>
-            </w:pPr>
-            <w:r>
-              <w:t xml:space="preserve">9</w:t>
+              <w:t xml:space="preserve">com.example.rastro.ExampleUnitTest</w:t>
+            </w:r>
+          </w:p>
+        </w:tc>
+        <w:tc>
+          <w:tcPr/>
+          <w:p>
+            <w:pPr>
+              <w:pStyle w:val="Compact"/>
+              <w:jc w:val="left"/>
+            </w:pPr>
+            <w:r>
+              <w:t xml:space="preserve">1</w:t>
             </w:r>
           </w:p>
         </w:tc>
@@ -15298,7 +15325,7 @@
               <w:jc w:val="left"/>
             </w:pPr>
             <w:r>
-              <w:t xml:space="preserve">0.01</w:t>
+              <w:t xml:space="preserve">0.004</w:t>
             </w:r>
           </w:p>
         </w:tc>
@@ -15312,19 +15339,19 @@
               <w:jc w:val="left"/>
             </w:pPr>
             <w:r>
-              <w:t xml:space="preserve">com.example.rastro.mapa.PerfilAlcanceTest</w:t>
-            </w:r>
-          </w:p>
-        </w:tc>
-        <w:tc>
-          <w:tcPr/>
-          <w:p>
-            <w:pPr>
-              <w:pStyle w:val="Compact"/>
-              <w:jc w:val="left"/>
-            </w:pPr>
-            <w:r>
-              <w:t xml:space="preserve">4</w:t>
+              <w:t xml:space="preserve">com.example.rastro.IMUReadTest</w:t>
+            </w:r>
+          </w:p>
+        </w:tc>
+        <w:tc>
+          <w:tcPr/>
+          <w:p>
+            <w:pPr>
+              <w:pStyle w:val="Compact"/>
+              <w:jc w:val="left"/>
+            </w:pPr>
+            <w:r>
+              <w:t xml:space="preserve">9</w:t>
             </w:r>
           </w:p>
         </w:tc>
@@ -15372,7 +15399,7 @@
               <w:jc w:val="left"/>
             </w:pPr>
             <w:r>
-              <w:t xml:space="preserve">0.004</w:t>
+              <w:t xml:space="preserve">0.006</w:t>
             </w:r>
           </w:p>
         </w:tc>
@@ -15386,7 +15413,7 @@
               <w:jc w:val="left"/>
             </w:pPr>
             <w:r>
-              <w:t xml:space="preserve">com.example.rastro.network.IdentidadeNoTest</w:t>
+              <w:t xml:space="preserve">com.example.rastro.mapa.PerfilAlcanceTest</w:t>
             </w:r>
           </w:p>
         </w:tc>
@@ -15446,7 +15473,7 @@
               <w:jc w:val="left"/>
             </w:pPr>
             <w:r>
-              <w:t xml:space="preserve">0.004</w:t>
+              <w:t xml:space="preserve">0.003</w:t>
             </w:r>
           </w:p>
         </w:tc>
@@ -15460,7 +15487,7 @@
               <w:jc w:val="left"/>
             </w:pPr>
             <w:r>
-              <w:t xml:space="preserve">com.example.rastro.network.MensagemTest</w:t>
+              <w:t xml:space="preserve">com.example.rastro.network.IdentidadeNoTest</w:t>
             </w:r>
           </w:p>
         </w:tc>
@@ -15520,7 +15547,7 @@
               <w:jc w:val="left"/>
             </w:pPr>
             <w:r>
-              <w:t xml:space="preserve">0.005</w:t>
+              <w:t xml:space="preserve">0.003</w:t>
             </w:r>
           </w:p>
         </w:tc>
@@ -15534,19 +15561,19 @@
               <w:jc w:val="left"/>
             </w:pPr>
             <w:r>
-              <w:t xml:space="preserve">com.example.rastro.network.MeshRouterTest</w:t>
-            </w:r>
-          </w:p>
-        </w:tc>
-        <w:tc>
-          <w:tcPr/>
-          <w:p>
-            <w:pPr>
-              <w:pStyle w:val="Compact"/>
-              <w:jc w:val="left"/>
-            </w:pPr>
-            <w:r>
-              <w:t xml:space="preserve">5</w:t>
+              <w:t xml:space="preserve">com.example.rastro.network.MensagemTest</w:t>
+            </w:r>
+          </w:p>
+        </w:tc>
+        <w:tc>
+          <w:tcPr/>
+          <w:p>
+            <w:pPr>
+              <w:pStyle w:val="Compact"/>
+              <w:jc w:val="left"/>
+            </w:pPr>
+            <w:r>
+              <w:t xml:space="preserve">4</w:t>
             </w:r>
           </w:p>
         </w:tc>
@@ -15594,7 +15621,7 @@
               <w:jc w:val="left"/>
             </w:pPr>
             <w:r>
-              <w:t xml:space="preserve">0.003</w:t>
+              <w:t xml:space="preserve">0.006</w:t>
             </w:r>
           </w:p>
         </w:tc>
@@ -15608,19 +15635,19 @@
               <w:jc w:val="left"/>
             </w:pPr>
             <w:r>
-              <w:t xml:space="preserve">com.example.rastro.network.ProtocoloV3Test</w:t>
-            </w:r>
-          </w:p>
-        </w:tc>
-        <w:tc>
-          <w:tcPr/>
-          <w:p>
-            <w:pPr>
-              <w:pStyle w:val="Compact"/>
-              <w:jc w:val="left"/>
-            </w:pPr>
-            <w:r>
-              <w:t xml:space="preserve">7</w:t>
+              <w:t xml:space="preserve">com.example.rastro.network.MeshRouterTest</w:t>
+            </w:r>
+          </w:p>
+        </w:tc>
+        <w:tc>
+          <w:tcPr/>
+          <w:p>
+            <w:pPr>
+              <w:pStyle w:val="Compact"/>
+              <w:jc w:val="left"/>
+            </w:pPr>
+            <w:r>
+              <w:t xml:space="preserve">5</w:t>
             </w:r>
           </w:p>
         </w:tc>
@@ -15668,7 +15695,7 @@
               <w:jc w:val="left"/>
             </w:pPr>
             <w:r>
-              <w:t xml:space="preserve">0.007</w:t>
+              <w:t xml:space="preserve">0.005</w:t>
             </w:r>
           </w:p>
         </w:tc>
@@ -15682,19 +15709,19 @@
               <w:jc w:val="left"/>
             </w:pPr>
             <w:r>
-              <w:t xml:space="preserve">com.example.rastro.PaginasPrincipaisTest</w:t>
-            </w:r>
-          </w:p>
-        </w:tc>
-        <w:tc>
-          <w:tcPr/>
-          <w:p>
-            <w:pPr>
-              <w:pStyle w:val="Compact"/>
-              <w:jc w:val="left"/>
-            </w:pPr>
-            <w:r>
-              <w:t xml:space="preserve">4</w:t>
+              <w:t xml:space="preserve">com.example.rastro.network.ProtocoloV3Test</w:t>
+            </w:r>
+          </w:p>
+        </w:tc>
+        <w:tc>
+          <w:tcPr/>
+          <w:p>
+            <w:pPr>
+              <w:pStyle w:val="Compact"/>
+              <w:jc w:val="left"/>
+            </w:pPr>
+            <w:r>
+              <w:t xml:space="preserve">7</w:t>
             </w:r>
           </w:p>
         </w:tc>
@@ -15742,7 +15769,7 @@
               <w:jc w:val="left"/>
             </w:pPr>
             <w:r>
-              <w:t xml:space="preserve">4.319</w:t>
+              <w:t xml:space="preserve">0.008</w:t>
             </w:r>
           </w:p>
         </w:tc>
@@ -15756,19 +15783,19 @@
               <w:jc w:val="left"/>
             </w:pPr>
             <w:r>
-              <w:t xml:space="preserve">com.example.rastro.PosicaoTest</w:t>
-            </w:r>
-          </w:p>
-        </w:tc>
-        <w:tc>
-          <w:tcPr/>
-          <w:p>
-            <w:pPr>
-              <w:pStyle w:val="Compact"/>
-              <w:jc w:val="left"/>
-            </w:pPr>
-            <w:r>
-              <w:t xml:space="preserve">13</w:t>
+              <w:t xml:space="preserve">com.example.rastro.PaginasPrincipaisTest</w:t>
+            </w:r>
+          </w:p>
+        </w:tc>
+        <w:tc>
+          <w:tcPr/>
+          <w:p>
+            <w:pPr>
+              <w:pStyle w:val="Compact"/>
+              <w:jc w:val="left"/>
+            </w:pPr>
+            <w:r>
+              <w:t xml:space="preserve">4</w:t>
             </w:r>
           </w:p>
         </w:tc>
@@ -15816,7 +15843,7 @@
               <w:jc w:val="left"/>
             </w:pPr>
             <w:r>
-              <w:t xml:space="preserve">0.014</w:t>
+              <w:t xml:space="preserve">3.455</w:t>
             </w:r>
           </w:p>
         </w:tc>
@@ -15830,19 +15857,19 @@
               <w:jc w:val="left"/>
             </w:pPr>
             <w:r>
-              <w:t xml:space="preserve">com.example.rastro.s2.CircularImuBufferConcurrencyTest</w:t>
-            </w:r>
-          </w:p>
-        </w:tc>
-        <w:tc>
-          <w:tcPr/>
-          <w:p>
-            <w:pPr>
-              <w:pStyle w:val="Compact"/>
-              <w:jc w:val="left"/>
-            </w:pPr>
-            <w:r>
-              <w:t xml:space="preserve">10</w:t>
+              <w:t xml:space="preserve">com.example.rastro.PosicaoTest</w:t>
+            </w:r>
+          </w:p>
+        </w:tc>
+        <w:tc>
+          <w:tcPr/>
+          <w:p>
+            <w:pPr>
+              <w:pStyle w:val="Compact"/>
+              <w:jc w:val="left"/>
+            </w:pPr>
+            <w:r>
+              <w:t xml:space="preserve">13</w:t>
             </w:r>
           </w:p>
         </w:tc>
@@ -15890,7 +15917,7 @@
               <w:jc w:val="left"/>
             </w:pPr>
             <w:r>
-              <w:t xml:space="preserve">0.058</w:t>
+              <w:t xml:space="preserve">0.017</w:t>
             </w:r>
           </w:p>
         </w:tc>
@@ -15904,19 +15931,19 @@
               <w:jc w:val="left"/>
             </w:pPr>
             <w:r>
-              <w:t xml:space="preserve">com.example.rastro.s2.CircularImuBufferTest</w:t>
-            </w:r>
-          </w:p>
-        </w:tc>
-        <w:tc>
-          <w:tcPr/>
-          <w:p>
-            <w:pPr>
-              <w:pStyle w:val="Compact"/>
-              <w:jc w:val="left"/>
-            </w:pPr>
-            <w:r>
-              <w:t xml:space="preserve">4</w:t>
+              <w:t xml:space="preserve">com.example.rastro.s2.CircularImuBufferConcurrencyTest</w:t>
+            </w:r>
+          </w:p>
+        </w:tc>
+        <w:tc>
+          <w:tcPr/>
+          <w:p>
+            <w:pPr>
+              <w:pStyle w:val="Compact"/>
+              <w:jc w:val="left"/>
+            </w:pPr>
+            <w:r>
+              <w:t xml:space="preserve">10</w:t>
             </w:r>
           </w:p>
         </w:tc>
@@ -15964,7 +15991,7 @@
               <w:jc w:val="left"/>
             </w:pPr>
             <w:r>
-              <w:t xml:space="preserve">0.002</w:t>
+              <w:t xml:space="preserve">0.054</w:t>
             </w:r>
           </w:p>
         </w:tc>
@@ -15978,19 +16005,19 @@
               <w:jc w:val="left"/>
             </w:pPr>
             <w:r>
-              <w:t xml:space="preserve">com.example.rastro.s2.CovarianciaTest</w:t>
-            </w:r>
-          </w:p>
-        </w:tc>
-        <w:tc>
-          <w:tcPr/>
-          <w:p>
-            <w:pPr>
-              <w:pStyle w:val="Compact"/>
-              <w:jc w:val="left"/>
-            </w:pPr>
-            <w:r>
-              <w:t xml:space="preserve">6</w:t>
+              <w:t xml:space="preserve">com.example.rastro.s2.CircularImuBufferTest</w:t>
+            </w:r>
+          </w:p>
+        </w:tc>
+        <w:tc>
+          <w:tcPr/>
+          <w:p>
+            <w:pPr>
+              <w:pStyle w:val="Compact"/>
+              <w:jc w:val="left"/>
+            </w:pPr>
+            <w:r>
+              <w:t xml:space="preserve">4</w:t>
             </w:r>
           </w:p>
         </w:tc>
@@ -16038,7 +16065,7 @@
               <w:jc w:val="left"/>
             </w:pPr>
             <w:r>
-              <w:t xml:space="preserve">0.003</w:t>
+              <w:t xml:space="preserve">0.002</w:t>
             </w:r>
           </w:p>
         </w:tc>
@@ -16052,19 +16079,19 @@
               <w:jc w:val="left"/>
             </w:pPr>
             <w:r>
-              <w:t xml:space="preserve">com.example.rastro.sos.HistoricoSessaoTest</w:t>
-            </w:r>
-          </w:p>
-        </w:tc>
-        <w:tc>
-          <w:tcPr/>
-          <w:p>
-            <w:pPr>
-              <w:pStyle w:val="Compact"/>
-              <w:jc w:val="left"/>
-            </w:pPr>
-            <w:r>
-              <w:t xml:space="preserve">5</w:t>
+              <w:t xml:space="preserve">com.example.rastro.s2.CovarianciaTest</w:t>
+            </w:r>
+          </w:p>
+        </w:tc>
+        <w:tc>
+          <w:tcPr/>
+          <w:p>
+            <w:pPr>
+              <w:pStyle w:val="Compact"/>
+              <w:jc w:val="left"/>
+            </w:pPr>
+            <w:r>
+              <w:t xml:space="preserve">6</w:t>
             </w:r>
           </w:p>
         </w:tc>
@@ -16126,6 +16153,80 @@
               <w:jc w:val="left"/>
             </w:pPr>
             <w:r>
+              <w:t xml:space="preserve">com.example.rastro.sos.HistoricoSessaoTest</w:t>
+            </w:r>
+          </w:p>
+        </w:tc>
+        <w:tc>
+          <w:tcPr/>
+          <w:p>
+            <w:pPr>
+              <w:pStyle w:val="Compact"/>
+              <w:jc w:val="left"/>
+            </w:pPr>
+            <w:r>
+              <w:t xml:space="preserve">5</w:t>
+            </w:r>
+          </w:p>
+        </w:tc>
+        <w:tc>
+          <w:tcPr/>
+          <w:p>
+            <w:pPr>
+              <w:pStyle w:val="Compact"/>
+              <w:jc w:val="left"/>
+            </w:pPr>
+            <w:r>
+              <w:t xml:space="preserve">0</w:t>
+            </w:r>
+          </w:p>
+        </w:tc>
+        <w:tc>
+          <w:tcPr/>
+          <w:p>
+            <w:pPr>
+              <w:pStyle w:val="Compact"/>
+              <w:jc w:val="left"/>
+            </w:pPr>
+            <w:r>
+              <w:t xml:space="preserve">0</w:t>
+            </w:r>
+          </w:p>
+        </w:tc>
+        <w:tc>
+          <w:tcPr/>
+          <w:p>
+            <w:pPr>
+              <w:pStyle w:val="Compact"/>
+              <w:jc w:val="left"/>
+            </w:pPr>
+            <w:r>
+              <w:t xml:space="preserve">0</w:t>
+            </w:r>
+          </w:p>
+        </w:tc>
+        <w:tc>
+          <w:tcPr/>
+          <w:p>
+            <w:pPr>
+              <w:pStyle w:val="Compact"/>
+              <w:jc w:val="left"/>
+            </w:pPr>
+            <w:r>
+              <w:t xml:space="preserve">0.004</w:t>
+            </w:r>
+          </w:p>
+        </w:tc>
+      </w:tr>
+      <w:tr>
+        <w:tc>
+          <w:tcPr/>
+          <w:p>
+            <w:pPr>
+              <w:pStyle w:val="Compact"/>
+              <w:jc w:val="left"/>
+            </w:pPr>
+            <w:r>
               <w:t xml:space="preserve">com.example.rastro.TrajetoTest</w:t>
             </w:r>
           </w:p>
@@ -16186,7 +16287,7 @@
               <w:jc w:val="left"/>
             </w:pPr>
             <w:r>
-              <w:t xml:space="preserve">0.01</w:t>
+              <w:t xml:space="preserve">0.011</w:t>
             </w:r>
           </w:p>
         </w:tc>

</xml_diff>

<commit_message>
docs(av1): a PR #1 foi revisada e aprovada pelo Juliano
O relatório e o rascunho do e-mail apresentavam Andre Bueno Ocanha como
revisor da pull request #1, mas quem a revisou, aprovou e mesclou foi
Juliano Cesar Ferreira Ramos. Corrigidos a seção 1, a seção 6 (6.1 a 6.3),
Limitações → Processo e o e-mail; PDF e DOCX gerados de novo (corpo com
12 páginas sem apêndices).

Co-authored-by: Andre Bueno Ocanha <andre.ocanha@estudante.ufla.br>
Co-authored-by: Juliano Cesar Ferreira Ramos <juliano.ramos@estudante.ufla.br>
Co-Authored-By: Claude Opus 5.5 <noreply@anthropic.com>
Claude-Session: https://claude.ai/code/session_01JVTB9w9nBpPR4Mc6csxBkp
</commit_message>
<xml_diff>
--- a/docs/relatorio/RELATORIO_AV1.docx
+++ b/docs/relatorio/RELATORIO_AV1.docx
@@ -415,13 +415,13 @@
         <w:t xml:space="preserve"> </w:t>
       </w:r>
       <w:r>
-        <w:t xml:space="preserve">e as telas; na AV1, compilou, testou e instalou o aplicativo no aparelho, propôs a correção D-22 e</w:t>
-      </w:r>
-      <w:r>
-        <w:t xml:space="preserve"> </w:t>
-      </w:r>
-      <w:r>
-        <w:t xml:space="preserve">fez as coletas.</w:t>
+        <w:t xml:space="preserve">e as telas; na AV1, compilou, testou e instalou o aplicativo no aparelho, propôs a correção D-22,</w:t>
+      </w:r>
+      <w:r>
+        <w:t xml:space="preserve"> </w:t>
+      </w:r>
+      <w:r>
+        <w:t xml:space="preserve">fez as coletas e revisou, aprovou e mesclou a pull request #1, desta entrega.</w:t>
       </w:r>
     </w:p>
     <w:p>
@@ -455,13 +455,7 @@
         <w:t xml:space="preserve"> </w:t>
       </w:r>
       <w:r>
-        <w:t xml:space="preserve">AV1, ajudando a escrever e conferindo, e por isso é coautor deles; revisor da pull request desta</w:t>
-      </w:r>
-      <w:r>
-        <w:t xml:space="preserve"> </w:t>
-      </w:r>
-      <w:r>
-        <w:t xml:space="preserve">entrega.</w:t>
+        <w:t xml:space="preserve">AV1, ajudando a escrever e conferindo, e por isso é coautor deles.</w:t>
       </w:r>
     </w:p>
     <w:bookmarkEnd w:id="20"/>
@@ -11117,7 +11111,7 @@
         <w:t xml:space="preserve">353bc47</w:t>
       </w:r>
       <w:r>
-        <w:t xml:space="preserve">. Nesta entrega,</w:t>
+        <w:t xml:space="preserve">. Nesta entrega:</w:t>
       </w:r>
       <w:r>
         <w:t xml:space="preserve"> </w:t>
@@ -11132,13 +11126,7 @@
         <w:t xml:space="preserve"> </w:t>
       </w:r>
       <w:r>
-        <w:t xml:space="preserve">(merge</w:t>
-      </w:r>
-      <w:r>
-        <w:t xml:space="preserve"> </w:t>
-      </w:r>
-      <w:r>
-        <w:t xml:space="preserve">da</w:t>
+        <w:t xml:space="preserve">e</w:t>
       </w:r>
       <w:r>
         <w:t xml:space="preserve"> </w:t>
@@ -11147,10 +11135,46 @@
         <w:rPr>
           <w:rStyle w:val="VerbatimChar"/>
         </w:rPr>
+        <w:t xml:space="preserve">ef190d6</w:t>
+      </w:r>
+      <w:r>
+        <w:t xml:space="preserve"> </w:t>
+      </w:r>
+      <w:r>
+        <w:t xml:space="preserve">(merges da</w:t>
+      </w:r>
+      <w:r>
+        <w:t xml:space="preserve"> </w:t>
+      </w:r>
+      <w:r>
+        <w:rPr>
+          <w:rStyle w:val="VerbatimChar"/>
+        </w:rPr>
         <w:t xml:space="preserve">main</w:t>
       </w:r>
       <w:r>
-        <w:t xml:space="preserve">, D-26 a D-32) e o commit de preenchimento final.</w:t>
+        <w:t xml:space="preserve">),</w:t>
+      </w:r>
+      <w:r>
+        <w:t xml:space="preserve"> </w:t>
+      </w:r>
+      <w:r>
+        <w:rPr>
+          <w:rStyle w:val="VerbatimChar"/>
+        </w:rPr>
+        <w:t xml:space="preserve">c0847a6</w:t>
+      </w:r>
+      <w:r>
+        <w:t xml:space="preserve"> </w:t>
+      </w:r>
+      <w:r>
+        <w:t xml:space="preserve">(preenchimento do relatório, das decisões e dos slides) e a</w:t>
+      </w:r>
+      <w:r>
+        <w:t xml:space="preserve"> </w:t>
+      </w:r>
+      <w:r>
+        <w:t xml:space="preserve">correção da revisão da pull request #1.</w:t>
       </w:r>
     </w:p>
     <w:bookmarkEnd w:id="55"/>
@@ -11810,13 +11834,86 @@
         <w:t xml:space="preserve"> </w:t>
       </w:r>
       <w:r>
-        <w:t xml:space="preserve">(22/10) e dos dois commits desta entrega; gravou a sessão bloqueada</w:t>
-      </w:r>
-      <w:r>
-        <w:t xml:space="preserve"> </w:t>
-      </w:r>
-      <w:r>
-        <w:t xml:space="preserve">de 21h12.</w:t>
+        <w:t xml:space="preserve">(22/10) e de</w:t>
+      </w:r>
+      <w:r>
+        <w:t xml:space="preserve"> </w:t>
+      </w:r>
+      <w:r>
+        <w:rPr>
+          <w:rStyle w:val="VerbatimChar"/>
+        </w:rPr>
+        <w:t xml:space="preserve">6addf61</w:t>
+      </w:r>
+      <w:r>
+        <w:t xml:space="preserve"> </w:t>
+      </w:r>
+      <w:r>
+        <w:t xml:space="preserve">e</w:t>
+      </w:r>
+      <w:r>
+        <w:t xml:space="preserve"> </w:t>
+      </w:r>
+      <w:r>
+        <w:rPr>
+          <w:rStyle w:val="VerbatimChar"/>
+        </w:rPr>
+        <w:t xml:space="preserve">c0847a6</w:t>
+      </w:r>
+      <w:r>
+        <w:t xml:space="preserve">, desta entrega; gravou a sessão</w:t>
+      </w:r>
+      <w:r>
+        <w:t xml:space="preserve"> </w:t>
+      </w:r>
+      <w:r>
+        <w:t xml:space="preserve">bloqueada de 21h12.</w:t>
+      </w:r>
+    </w:p>
+    <w:p>
+      <w:pPr>
+        <w:numPr>
+          <w:ilvl w:val="0"/>
+          <w:numId w:val="1005"/>
+        </w:numPr>
+        <w:pStyle w:val="Compact"/>
+      </w:pPr>
+      <w:r>
+        <w:rPr>
+          <w:bCs/>
+          <w:b/>
+        </w:rPr>
+        <w:t xml:space="preserve">Revisão.</w:t>
+      </w:r>
+      <w:r>
+        <w:t xml:space="preserve"> </w:t>
+      </w:r>
+      <w:r>
+        <w:t xml:space="preserve">Revisou, aprovou e mesclou a pull request #1 (</w:t>
+      </w:r>
+      <w:r>
+        <w:rPr>
+          <w:rStyle w:val="VerbatimChar"/>
+        </w:rPr>
+        <w:t xml:space="preserve">origin/joao</w:t>
+      </w:r>
+      <w:r>
+        <w:t xml:space="preserve"> </w:t>
+      </w:r>
+      <w:r>
+        <w:t xml:space="preserve">→</w:t>
+      </w:r>
+      <w:r>
+        <w:t xml:space="preserve"> </w:t>
+      </w:r>
+      <w:r>
+        <w:rPr>
+          <w:rStyle w:val="VerbatimChar"/>
+        </w:rPr>
+        <w:t xml:space="preserve">main</w:t>
+      </w:r>
+      <w:r>
+        <w:t xml:space="preserve">) em 23/10/2026.</w:t>
       </w:r>
     </w:p>
     <w:bookmarkEnd w:id="56"/>
@@ -12176,29 +12273,7 @@
         <w:pStyle w:val="Compact"/>
       </w:pPr>
       <w:r>
-        <w:t xml:space="preserve">É coautor também dos dois commits desta entrega.</w:t>
-      </w:r>
-    </w:p>
-    <w:p>
-      <w:pPr>
-        <w:numPr>
-          <w:ilvl w:val="0"/>
-          <w:numId w:val="1006"/>
-        </w:numPr>
-        <w:pStyle w:val="Compact"/>
-      </w:pPr>
-      <w:r>
-        <w:rPr>
-          <w:bCs/>
-          <w:b/>
-        </w:rPr>
-        <w:t xml:space="preserve">Revisão.</w:t>
-      </w:r>
-      <w:r>
-        <w:t xml:space="preserve"> </w:t>
-      </w:r>
-      <w:r>
-        <w:t xml:space="preserve">Revisor da pull request de</w:t>
+        <w:t xml:space="preserve">É coautor também de</w:t>
       </w:r>
       <w:r>
         <w:t xml:space="preserve"> </w:t>
@@ -12207,13 +12282,13 @@
         <w:rPr>
           <w:rStyle w:val="VerbatimChar"/>
         </w:rPr>
-        <w:t xml:space="preserve">origin/joao</w:t>
-      </w:r>
-      <w:r>
-        <w:t xml:space="preserve"> </w:t>
-      </w:r>
-      <w:r>
-        <w:t xml:space="preserve">para a</w:t>
+        <w:t xml:space="preserve">6addf61</w:t>
+      </w:r>
+      <w:r>
+        <w:t xml:space="preserve"> </w:t>
+      </w:r>
+      <w:r>
+        <w:t xml:space="preserve">e</w:t>
       </w:r>
       <w:r>
         <w:t xml:space="preserve"> </w:t>
@@ -12222,10 +12297,10 @@
         <w:rPr>
           <w:rStyle w:val="VerbatimChar"/>
         </w:rPr>
-        <w:t xml:space="preserve">main</w:t>
-      </w:r>
-      <w:r>
-        <w:t xml:space="preserve">.</w:t>
+        <w:t xml:space="preserve">c0847a6</w:t>
+      </w:r>
+      <w:r>
+        <w:t xml:space="preserve">, desta entrega.</w:t>
       </w:r>
     </w:p>
     <w:bookmarkEnd w:id="57"/>
@@ -12701,13 +12776,22 @@
         <w:t xml:space="preserve">main</w:t>
       </w:r>
       <w:r>
-        <w:t xml:space="preserve">, é a desta entrega, aberta</w:t>
-      </w:r>
-      <w:r>
-        <w:t xml:space="preserve"> </w:t>
-      </w:r>
-      <w:r>
-        <w:t xml:space="preserve">depois do prazo para revisão de Andre Bueno Ocanha. Não há integração contínua: os testes rodam com</w:t>
+        <w:t xml:space="preserve"> </w:t>
+      </w:r>
+      <w:r>
+        <w:t xml:space="preserve">(#1), foi a desta</w:t>
+      </w:r>
+      <w:r>
+        <w:t xml:space="preserve"> </w:t>
+      </w:r>
+      <w:r>
+        <w:t xml:space="preserve">entrega, aberta depois do prazo e revisada, aprovada e mesclada por Juliano Cesar Ferreira Ramos em</w:t>
+      </w:r>
+      <w:r>
+        <w:t xml:space="preserve"> </w:t>
+      </w:r>
+      <w:r>
+        <w:t xml:space="preserve">23/10/2026. Não há integração contínua: os testes rodam com</w:t>
       </w:r>
       <w:r>
         <w:t xml:space="preserve"> </w:t>

</xml_diff>